<commit_message>
Formalizar protocolo e incorporar actas como imagen de una página
Redacción institucional del PROT-HC-001 para el Hospital General
Puyo e inclusión de Actas 01-06 y Anexos A-B como formatos
visuales profesionales de una sola página.

Co-authored-by: subdirecadmi2026 <subdirecadmi2026@users.noreply.github.com>
</commit_message>
<xml_diff>
--- a/docs/historia-clinica-ecuador/anexos/ACTA_01_Deteccion_y_notificacion.docx
+++ b/docs/historia-clinica-ecuador/anexos/ACTA_01_Deteccion_y_notificacion.docx
@@ -2,1286 +2,54 @@
 <file path=word/document.xml><?xml version="1.0" encoding="utf-8"?>
 <w:document xmlns:wpc="http://schemas.microsoft.com/office/word/2010/wordprocessingCanvas" xmlns:mo="http://schemas.microsoft.com/office/mac/office/2008/main" xmlns:mc="http://schemas.openxmlformats.org/markup-compatibility/2006" xmlns:mv="urn:schemas-microsoft-com:mac:vml" xmlns:o="urn:schemas-microsoft-com:office:office" xmlns:r="http://schemas.openxmlformats.org/officeDocument/2006/relationships" xmlns:m="http://schemas.openxmlformats.org/officeDocument/2006/math" xmlns:v="urn:schemas-microsoft-com:vml" xmlns:wp14="http://schemas.microsoft.com/office/word/2010/wordprocessingDrawing" xmlns:wp="http://schemas.openxmlformats.org/drawingml/2006/wordprocessingDrawing" xmlns:w10="urn:schemas-microsoft-com:office:word" xmlns:w="http://schemas.openxmlformats.org/wordprocessingml/2006/main" xmlns:w14="http://schemas.microsoft.com/office/word/2010/wordml" xmlns:wpg="http://schemas.microsoft.com/office/word/2010/wordprocessingGroup" xmlns:wpi="http://schemas.microsoft.com/office/word/2010/wordprocessingInk" xmlns:wne="http://schemas.microsoft.com/office/word/2006/wordml" xmlns:wps="http://schemas.microsoft.com/office/word/2010/wordprocessingShape" mc:Ignorable="w14 wp14">
   <w:body>
-    <w:tbl>
-      <w:tblPr>
-        <w:tblW w:type="auto" w:w="0"/>
-        <w:tblLook w:firstColumn="1" w:firstRow="1" w:lastColumn="0" w:lastRow="0" w:noHBand="0" w:noVBand="1" w:val="04A0"/>
-      </w:tblPr>
-      <w:tblGrid>
-        <w:gridCol w:w="10200"/>
-      </w:tblGrid>
-      <w:tr>
-        <w:tc>
-          <w:tcPr>
-            <w:tcW w:type="dxa" w:w="10200"/>
-            <w:shd w:fill="FFFFFF" w:val="clear"/>
-            <w:tcBorders>
-              <w:top w:val="single" w:sz="5" w:space="0" w:color="D0DCE3"/>
-              <w:left w:val="single" w:sz="5" w:space="0" w:color="D0DCE3"/>
-              <w:bottom w:val="single" w:sz="5" w:space="0" w:color="D0DCE3"/>
-              <w:right w:val="single" w:sz="5" w:space="0" w:color="D0DCE3"/>
-            </w:tcBorders>
-            <w:tcMar>
-              <w:top w:w="35" w:type="dxa"/>
-              <w:left w:w="40" w:type="dxa"/>
-              <w:bottom w:w="25" w:type="dxa"/>
-              <w:right w:w="40" w:type="dxa"/>
-            </w:tcMar>
-          </w:tcPr>
-          <w:p>
-            <w:pPr>
-              <w:jc w:val="center"/>
-            </w:pPr>
-            <w:r/>
-            <w:r>
-              <w:drawing>
-                <wp:inline xmlns:a="http://schemas.openxmlformats.org/drawingml/2006/main" xmlns:pic="http://schemas.openxmlformats.org/drawingml/2006/picture">
-                  <wp:extent cx="3060000" cy="926573"/>
-                  <wp:docPr id="1" name="Picture 1"/>
-                  <wp:cNvGraphicFramePr>
-                    <a:graphicFrameLocks noChangeAspect="1"/>
-                  </wp:cNvGraphicFramePr>
-                  <a:graphic>
-                    <a:graphicData uri="http://schemas.openxmlformats.org/drawingml/2006/picture">
-                      <pic:pic>
-                        <pic:nvPicPr>
-                          <pic:cNvPr id="0" name="logo_msp.png"/>
-                          <pic:cNvPicPr/>
-                        </pic:nvPicPr>
-                        <pic:blipFill>
-                          <a:blip r:embed="rId11"/>
-                          <a:stretch>
-                            <a:fillRect/>
-                          </a:stretch>
-                        </pic:blipFill>
-                        <pic:spPr>
-                          <a:xfrm>
-                            <a:off x="0" y="0"/>
-                            <a:ext cx="3060000" cy="926573"/>
-                          </a:xfrm>
-                          <a:prstGeom prst="rect"/>
-                        </pic:spPr>
-                      </pic:pic>
-                    </a:graphicData>
-                  </a:graphic>
-                </wp:inline>
-              </w:drawing>
-            </w:r>
-          </w:p>
-          <w:p>
-            <w:pPr>
-              <w:jc w:val="center"/>
-            </w:pPr>
-            <w:r>
-              <w:rPr>
-                <w:rFonts w:ascii="Calibri" w:hAnsi="Calibri"/>
-                <w:b/>
-                <w:i w:val="0"/>
-                <w:color w:val="3D4A57"/>
-                <w:sz w:val="16"/>
-              </w:rPr>
-              <w:t>MINISTERIO DE SALUD PÚBLICA DEL ECUADOR</w:t>
-            </w:r>
-          </w:p>
-        </w:tc>
-      </w:tr>
-    </w:tbl>
-    <w:tbl>
-      <w:tblPr>
-        <w:tblW w:type="auto" w:w="0"/>
-        <w:tblLook w:firstColumn="1" w:firstRow="1" w:lastColumn="0" w:lastRow="0" w:noHBand="0" w:noVBand="1" w:val="04A0"/>
-      </w:tblPr>
-      <w:tblGrid>
-        <w:gridCol w:w="3400"/>
-        <w:gridCol w:w="3400"/>
-        <w:gridCol w:w="3400"/>
-      </w:tblGrid>
-      <w:tr>
-        <w:tc>
-          <w:tcPr>
-            <w:tcW w:type="dxa" w:w="3400"/>
-            <w:shd w:fill="F5D402" w:val="clear"/>
-            <w:tcBorders>
-              <w:top w:val="single" w:sz="2" w:space="0" w:color="F5D402"/>
-              <w:left w:val="single" w:sz="2" w:space="0" w:color="F5D402"/>
-              <w:bottom w:val="single" w:sz="2" w:space="0" w:color="F5D402"/>
-              <w:right w:val="single" w:sz="2" w:space="0" w:color="F5D402"/>
-            </w:tcBorders>
-            <w:tcMar>
-              <w:top w:w="6" w:type="dxa"/>
-              <w:left w:w="0" w:type="dxa"/>
-              <w:bottom w:w="6" w:type="dxa"/>
-              <w:right w:w="0" w:type="dxa"/>
-            </w:tcMar>
-          </w:tcPr>
-          <w:p>
-            <w:r/>
-          </w:p>
-        </w:tc>
-        <w:tc>
-          <w:tcPr>
-            <w:tcW w:type="dxa" w:w="3400"/>
-            <w:shd w:fill="191497" w:val="clear"/>
-            <w:tcBorders>
-              <w:top w:val="single" w:sz="2" w:space="0" w:color="191497"/>
-              <w:left w:val="single" w:sz="2" w:space="0" w:color="191497"/>
-              <w:bottom w:val="single" w:sz="2" w:space="0" w:color="191497"/>
-              <w:right w:val="single" w:sz="2" w:space="0" w:color="191497"/>
-            </w:tcBorders>
-            <w:tcMar>
-              <w:top w:w="6" w:type="dxa"/>
-              <w:left w:w="0" w:type="dxa"/>
-              <w:bottom w:w="6" w:type="dxa"/>
-              <w:right w:w="0" w:type="dxa"/>
-            </w:tcMar>
-          </w:tcPr>
-          <w:p>
-            <w:r/>
-          </w:p>
-        </w:tc>
-        <w:tc>
-          <w:tcPr>
-            <w:tcW w:type="dxa" w:w="3400"/>
-            <w:shd w:fill="D61A0C" w:val="clear"/>
-            <w:tcBorders>
-              <w:top w:val="single" w:sz="2" w:space="0" w:color="D61A0C"/>
-              <w:left w:val="single" w:sz="2" w:space="0" w:color="D61A0C"/>
-              <w:bottom w:val="single" w:sz="2" w:space="0" w:color="D61A0C"/>
-              <w:right w:val="single" w:sz="2" w:space="0" w:color="D61A0C"/>
-            </w:tcBorders>
-            <w:tcMar>
-              <w:top w:w="6" w:type="dxa"/>
-              <w:left w:w="0" w:type="dxa"/>
-              <w:bottom w:w="6" w:type="dxa"/>
-              <w:right w:w="0" w:type="dxa"/>
-            </w:tcMar>
-          </w:tcPr>
-          <w:p>
-            <w:r/>
-          </w:p>
-        </w:tc>
-      </w:tr>
-    </w:tbl>
     <w:p>
       <w:pPr>
-        <w:spacing w:after="100"/>
-      </w:pPr>
-    </w:p>
-    <w:p>
-      <w:pPr>
-        <w:spacing w:before="0" w:after="20" w:line="259" w:lineRule="auto"/>
+        <w:spacing w:before="0" w:after="0"/>
         <w:jc w:val="center"/>
       </w:pPr>
       <w:r>
-        <w:rPr>
-          <w:rFonts w:ascii="Calibri" w:hAnsi="Calibri"/>
-          <w:b/>
-          <w:i w:val="0"/>
-          <w:color w:val="1E3A5F"/>
-          <w:sz w:val="24"/>
-        </w:rPr>
-        <w:t>HOSPITAL GENERAL PUYO</w:t>
+        <w:drawing>
+          <wp:inline xmlns:a="http://schemas.openxmlformats.org/drawingml/2006/main" xmlns:pic="http://schemas.openxmlformats.org/drawingml/2006/picture">
+            <wp:extent cx="7128000" cy="10080044"/>
+            <wp:docPr id="1" name="Picture 1"/>
+            <wp:cNvGraphicFramePr>
+              <a:graphicFrameLocks noChangeAspect="1"/>
+            </wp:cNvGraphicFramePr>
+            <a:graphic>
+              <a:graphicData uri="http://schemas.openxmlformats.org/drawingml/2006/picture">
+                <pic:pic>
+                  <pic:nvPicPr>
+                    <pic:cNvPr id="0" name="ACTA_01.png"/>
+                    <pic:cNvPicPr/>
+                  </pic:nvPicPr>
+                  <pic:blipFill>
+                    <a:blip r:embed="rId9"/>
+                    <a:stretch>
+                      <a:fillRect/>
+                    </a:stretch>
+                  </pic:blipFill>
+                  <pic:spPr>
+                    <a:xfrm>
+                      <a:off x="0" y="0"/>
+                      <a:ext cx="7128000" cy="10080044"/>
+                    </a:xfrm>
+                    <a:prstGeom prst="rect"/>
+                  </pic:spPr>
+                </pic:pic>
+              </a:graphicData>
+            </a:graphic>
+          </wp:inline>
+        </w:drawing>
       </w:r>
     </w:p>
-    <w:p>
-      <w:pPr>
-        <w:spacing w:before="0" w:after="20" w:line="259" w:lineRule="auto"/>
-        <w:jc w:val="center"/>
-      </w:pPr>
-      <w:r>
-        <w:rPr>
-          <w:rFonts w:ascii="Calibri" w:hAnsi="Calibri"/>
-          <w:b/>
-          <w:i w:val="0"/>
-          <w:color w:val="2A6F6F"/>
-          <w:sz w:val="20"/>
-        </w:rPr>
-        <w:t>ACTA 01</w:t>
-      </w:r>
-    </w:p>
-    <w:p>
-      <w:pPr>
-        <w:spacing w:before="0" w:after="40" w:line="259" w:lineRule="auto"/>
-        <w:jc w:val="center"/>
-      </w:pPr>
-      <w:r>
-        <w:rPr>
-          <w:rFonts w:ascii="Calibri" w:hAnsi="Calibri"/>
-          <w:b/>
-          <w:i w:val="0"/>
-          <w:color w:val="1E3A5F"/>
-          <w:sz w:val="28"/>
-        </w:rPr>
-        <w:t>Detección y notificación</w:t>
-      </w:r>
-    </w:p>
-    <w:p>
-      <w:pPr>
-        <w:spacing w:before="0" w:after="40" w:line="259" w:lineRule="auto"/>
-        <w:jc w:val="center"/>
-      </w:pPr>
-      <w:r>
-        <w:rPr>
-          <w:rFonts w:ascii="Calibri" w:hAnsi="Calibri"/>
-          <w:b w:val="0"/>
-          <w:i/>
-          <w:color w:val="3D4A57"/>
-          <w:sz w:val="18"/>
-        </w:rPr>
-        <w:t>Protocolo de pérdida de Historia Clínica</w:t>
-      </w:r>
-    </w:p>
-    <w:p>
-      <w:pPr>
-        <w:spacing w:before="0" w:after="100"/>
-        <w:pBdr>
-          <w:bottom w:val="single" w:sz="10" w:space="1" w:color="C5D4DC"/>
-        </w:pBdr>
-      </w:pPr>
-    </w:p>
-    <w:tbl>
-      <w:tblPr>
-        <w:tblW w:type="auto" w:w="0"/>
-        <w:tblLook w:firstColumn="1" w:firstRow="1" w:lastColumn="0" w:lastRow="0" w:noHBand="0" w:noVBand="1" w:val="04A0"/>
-      </w:tblPr>
-      <w:tblGrid>
-        <w:gridCol w:w="3400"/>
-        <w:gridCol w:w="3400"/>
-        <w:gridCol w:w="3400"/>
-      </w:tblGrid>
-      <w:tr>
-        <w:tc>
-          <w:tcPr>
-            <w:tcW w:type="dxa" w:w="3400"/>
-            <w:shd w:fill="F7F9FA" w:val="clear"/>
-            <w:tcBorders>
-              <w:top w:val="single" w:sz="4" w:space="0" w:color="D0DCE3"/>
-              <w:left w:val="single" w:sz="4" w:space="0" w:color="D0DCE3"/>
-              <w:bottom w:val="single" w:sz="4" w:space="0" w:color="D0DCE3"/>
-              <w:right w:val="single" w:sz="4" w:space="0" w:color="D0DCE3"/>
-            </w:tcBorders>
-            <w:tcMar>
-              <w:top w:w="35" w:type="dxa"/>
-              <w:left w:w="30" w:type="dxa"/>
-              <w:bottom w:w="35" w:type="dxa"/>
-              <w:right w:w="30" w:type="dxa"/>
-            </w:tcMar>
-          </w:tcPr>
-          <w:p>
-            <w:pPr>
-              <w:jc w:val="center"/>
-            </w:pPr>
-            <w:r/>
-            <w:r>
-              <w:rPr>
-                <w:rFonts w:ascii="Calibri" w:hAnsi="Calibri"/>
-                <w:b/>
-                <w:i w:val="0"/>
-                <w:color w:val="2A6F6F"/>
-                <w:sz w:val="14"/>
-              </w:rPr>
-              <w:t>Código protocolo</w:t>
-              <w:br/>
-            </w:r>
-            <w:r>
-              <w:rPr>
-                <w:rFonts w:ascii="Calibri" w:hAnsi="Calibri"/>
-                <w:b/>
-                <w:i w:val="0"/>
-                <w:color w:val="1E3A5F"/>
-                <w:sz w:val="18"/>
-              </w:rPr>
-              <w:t>PROT-HC-001</w:t>
-            </w:r>
-          </w:p>
-        </w:tc>
-        <w:tc>
-          <w:tcPr>
-            <w:tcW w:type="dxa" w:w="3400"/>
-            <w:shd w:fill="F7F9FA" w:val="clear"/>
-            <w:tcBorders>
-              <w:top w:val="single" w:sz="4" w:space="0" w:color="D0DCE3"/>
-              <w:left w:val="single" w:sz="4" w:space="0" w:color="D0DCE3"/>
-              <w:bottom w:val="single" w:sz="4" w:space="0" w:color="D0DCE3"/>
-              <w:right w:val="single" w:sz="4" w:space="0" w:color="D0DCE3"/>
-            </w:tcBorders>
-            <w:tcMar>
-              <w:top w:w="35" w:type="dxa"/>
-              <w:left w:w="30" w:type="dxa"/>
-              <w:bottom w:w="35" w:type="dxa"/>
-              <w:right w:w="30" w:type="dxa"/>
-            </w:tcMar>
-          </w:tcPr>
-          <w:p>
-            <w:pPr>
-              <w:jc w:val="center"/>
-            </w:pPr>
-            <w:r/>
-            <w:r>
-              <w:rPr>
-                <w:rFonts w:ascii="Calibri" w:hAnsi="Calibri"/>
-                <w:b/>
-                <w:i w:val="0"/>
-                <w:color w:val="2A6F6F"/>
-                <w:sz w:val="14"/>
-              </w:rPr>
-              <w:t>Clasificación</w:t>
-              <w:br/>
-            </w:r>
-            <w:r>
-              <w:rPr>
-                <w:rFonts w:ascii="Calibri" w:hAnsi="Calibri"/>
-                <w:b/>
-                <w:i w:val="0"/>
-                <w:color w:val="1E3A5F"/>
-                <w:sz w:val="18"/>
-              </w:rPr>
-              <w:t>CONFIDENCIAL</w:t>
-            </w:r>
-          </w:p>
-        </w:tc>
-        <w:tc>
-          <w:tcPr>
-            <w:tcW w:type="dxa" w:w="3400"/>
-            <w:shd w:fill="F7F9FA" w:val="clear"/>
-            <w:tcBorders>
-              <w:top w:val="single" w:sz="4" w:space="0" w:color="D0DCE3"/>
-              <w:left w:val="single" w:sz="4" w:space="0" w:color="D0DCE3"/>
-              <w:bottom w:val="single" w:sz="4" w:space="0" w:color="D0DCE3"/>
-              <w:right w:val="single" w:sz="4" w:space="0" w:color="D0DCE3"/>
-            </w:tcBorders>
-            <w:tcMar>
-              <w:top w:w="35" w:type="dxa"/>
-              <w:left w:w="30" w:type="dxa"/>
-              <w:bottom w:w="35" w:type="dxa"/>
-              <w:right w:w="30" w:type="dxa"/>
-            </w:tcMar>
-          </w:tcPr>
-          <w:p>
-            <w:pPr>
-              <w:jc w:val="center"/>
-            </w:pPr>
-            <w:r/>
-            <w:r>
-              <w:rPr>
-                <w:rFonts w:ascii="Calibri" w:hAnsi="Calibri"/>
-                <w:b/>
-                <w:i w:val="0"/>
-                <w:color w:val="2A6F6F"/>
-                <w:sz w:val="14"/>
-              </w:rPr>
-              <w:t>Contacto</w:t>
-              <w:br/>
-            </w:r>
-            <w:r>
-              <w:rPr>
-                <w:rFonts w:ascii="Calibri" w:hAnsi="Calibri"/>
-                <w:b/>
-                <w:i w:val="0"/>
-                <w:color w:val="1E3A5F"/>
-                <w:sz w:val="18"/>
-              </w:rPr>
-              <w:t>0991976454</w:t>
-            </w:r>
-          </w:p>
-        </w:tc>
-      </w:tr>
-    </w:tbl>
-    <w:p>
-      <w:pPr>
-        <w:spacing w:before="0" w:after="80" w:line="259" w:lineRule="auto"/>
-      </w:pPr>
-    </w:p>
-    <w:p>
-      <w:pPr>
-        <w:spacing w:before="0" w:after="40" w:line="259" w:lineRule="auto"/>
-      </w:pPr>
-      <w:r>
-        <w:rPr>
-          <w:rFonts w:ascii="Calibri" w:hAnsi="Calibri"/>
-          <w:b w:val="0"/>
-          <w:i w:val="0"/>
-          <w:color w:val="3D4A57"/>
-          <w:sz w:val="18"/>
-        </w:rPr>
-        <w:t>Establecimiento: _______________________________________________</w:t>
-      </w:r>
-    </w:p>
-    <w:p>
-      <w:pPr>
-        <w:spacing w:before="0" w:after="40" w:line="259" w:lineRule="auto"/>
-      </w:pPr>
-      <w:r>
-        <w:rPr>
-          <w:rFonts w:ascii="Calibri" w:hAnsi="Calibri"/>
-          <w:b w:val="0"/>
-          <w:i w:val="0"/>
-          <w:color w:val="3D4A57"/>
-          <w:sz w:val="18"/>
-        </w:rPr>
-        <w:t>N.º incidente  INC-HC-________-______: _______________________________________________</w:t>
-      </w:r>
-    </w:p>
-    <w:p>
-      <w:pPr>
-        <w:spacing w:before="0" w:after="40" w:line="259" w:lineRule="auto"/>
-      </w:pPr>
-      <w:r>
-        <w:rPr>
-          <w:rFonts w:ascii="Calibri" w:hAnsi="Calibri"/>
-          <w:b w:val="0"/>
-          <w:i w:val="0"/>
-          <w:color w:val="3D4A57"/>
-          <w:sz w:val="18"/>
-        </w:rPr>
-        <w:t>Fecha __/__/______     Hora __:__: _______________________________________________</w:t>
-      </w:r>
-    </w:p>
-    <w:p>
-      <w:pPr>
-        <w:spacing w:before="120" w:after="40" w:line="259" w:lineRule="auto"/>
-      </w:pPr>
-      <w:r>
-        <w:rPr>
-          <w:rFonts w:ascii="Calibri" w:hAnsi="Calibri"/>
-          <w:b/>
-          <w:i w:val="0"/>
-          <w:color w:val="2A6F6F"/>
-          <w:sz w:val="20"/>
-        </w:rPr>
-        <w:t>1. QUIEN DETECTA</w:t>
-      </w:r>
-    </w:p>
-    <w:p>
-      <w:pPr>
-        <w:spacing w:before="0" w:after="40" w:line="259" w:lineRule="auto"/>
-      </w:pPr>
-      <w:r>
-        <w:rPr>
-          <w:rFonts w:ascii="Calibri" w:hAnsi="Calibri"/>
-          <w:b w:val="0"/>
-          <w:i w:val="0"/>
-          <w:color w:val="3D4A57"/>
-          <w:sz w:val="18"/>
-        </w:rPr>
-        <w:t>Nombre: _______________________________________________</w:t>
-      </w:r>
-    </w:p>
-    <w:p>
-      <w:pPr>
-        <w:spacing w:before="0" w:after="40" w:line="259" w:lineRule="auto"/>
-      </w:pPr>
-      <w:r>
-        <w:rPr>
-          <w:rFonts w:ascii="Calibri" w:hAnsi="Calibri"/>
-          <w:b w:val="0"/>
-          <w:i w:val="0"/>
-          <w:color w:val="3D4A57"/>
-          <w:sz w:val="18"/>
-        </w:rPr>
-        <w:t>Cargo: _______________________________________________</w:t>
-      </w:r>
-    </w:p>
-    <w:p>
-      <w:pPr>
-        <w:spacing w:before="0" w:after="40" w:line="259" w:lineRule="auto"/>
-      </w:pPr>
-      <w:r>
-        <w:rPr>
-          <w:rFonts w:ascii="Calibri" w:hAnsi="Calibri"/>
-          <w:b w:val="0"/>
-          <w:i w:val="0"/>
-          <w:color w:val="3D4A57"/>
-          <w:sz w:val="18"/>
-        </w:rPr>
-        <w:t>Cédula / identificación: _______________________________________________</w:t>
-      </w:r>
-    </w:p>
-    <w:p>
-      <w:pPr>
-        <w:spacing w:before="120" w:after="40" w:line="259" w:lineRule="auto"/>
-      </w:pPr>
-      <w:r>
-        <w:rPr>
-          <w:rFonts w:ascii="Calibri" w:hAnsi="Calibri"/>
-          <w:b/>
-          <w:i w:val="0"/>
-          <w:color w:val="2A6F6F"/>
-          <w:sz w:val="20"/>
-        </w:rPr>
-        <w:t>2. TIPO DE EVENTO</w:t>
-      </w:r>
-    </w:p>
-    <w:p>
-      <w:pPr>
-        <w:spacing w:before="0" w:after="20"/>
-        <w:ind w:left="113"/>
-      </w:pPr>
-      <w:r>
-        <w:rPr>
-          <w:rFonts w:ascii="Calibri" w:hAnsi="Calibri"/>
-          <w:b w:val="0"/>
-          <w:i w:val="0"/>
-          <w:color w:val="3D4A57"/>
-          <w:sz w:val="18"/>
-        </w:rPr>
-        <w:t>☐  E1 Extravío unitario</w:t>
-      </w:r>
-    </w:p>
-    <w:p>
-      <w:pPr>
-        <w:spacing w:before="0" w:after="20"/>
-        <w:ind w:left="113"/>
-      </w:pPr>
-      <w:r>
-        <w:rPr>
-          <w:rFonts w:ascii="Calibri" w:hAnsi="Calibri"/>
-          <w:b w:val="0"/>
-          <w:i w:val="0"/>
-          <w:color w:val="3D4A57"/>
-          <w:sz w:val="18"/>
-        </w:rPr>
-        <w:t>☐  E2 Deterioro parcial</w:t>
-      </w:r>
-    </w:p>
-    <w:p>
-      <w:pPr>
-        <w:spacing w:before="0" w:after="20"/>
-        <w:ind w:left="113"/>
-      </w:pPr>
-      <w:r>
-        <w:rPr>
-          <w:rFonts w:ascii="Calibri" w:hAnsi="Calibri"/>
-          <w:b w:val="0"/>
-          <w:i w:val="0"/>
-          <w:color w:val="3D4A57"/>
-          <w:sz w:val="18"/>
-        </w:rPr>
-        <w:t>☐  E3 Pérdida parcial del archivo</w:t>
-      </w:r>
-    </w:p>
-    <w:p>
-      <w:pPr>
-        <w:spacing w:before="0" w:after="20"/>
-        <w:ind w:left="113"/>
-      </w:pPr>
-      <w:r>
-        <w:rPr>
-          <w:rFonts w:ascii="Calibri" w:hAnsi="Calibri"/>
-          <w:b w:val="0"/>
-          <w:i w:val="0"/>
-          <w:color w:val="3D4A57"/>
-          <w:sz w:val="18"/>
-        </w:rPr>
-        <w:t>☐  E4 Pérdida total del archivo</w:t>
-      </w:r>
-    </w:p>
-    <w:p>
-      <w:pPr>
-        <w:spacing w:before="0" w:after="20"/>
-        <w:ind w:left="113"/>
-      </w:pPr>
-      <w:r>
-        <w:rPr>
-          <w:rFonts w:ascii="Calibri" w:hAnsi="Calibri"/>
-          <w:b w:val="0"/>
-          <w:i w:val="0"/>
-          <w:color w:val="3D4A57"/>
-          <w:sz w:val="18"/>
-        </w:rPr>
-        <w:t>☐  E5 Indisponibilidad electrónica</w:t>
-      </w:r>
-    </w:p>
-    <w:p>
-      <w:pPr>
-        <w:spacing w:before="0" w:after="40" w:line="259" w:lineRule="auto"/>
-      </w:pPr>
-      <w:r>
-        <w:rPr>
-          <w:rFonts w:ascii="Calibri" w:hAnsi="Calibri"/>
-          <w:b w:val="0"/>
-          <w:i w:val="0"/>
-          <w:color w:val="3D4A57"/>
-          <w:sz w:val="18"/>
-        </w:rPr>
-        <w:t>Descripción del hecho: _______________________________________________</w:t>
-      </w:r>
-    </w:p>
-    <w:p>
-      <w:pPr>
-        <w:spacing w:before="120" w:after="40" w:line="259" w:lineRule="auto"/>
-      </w:pPr>
-      <w:r>
-        <w:rPr>
-          <w:rFonts w:ascii="Calibri" w:hAnsi="Calibri"/>
-          <w:b/>
-          <w:i w:val="0"/>
-          <w:color w:val="2A6F6F"/>
-          <w:sz w:val="20"/>
-        </w:rPr>
-        <w:t>3. HISTORIA(S) CLÍNICA(S) AFECTADA(S)</w:t>
-      </w:r>
-    </w:p>
-    <w:p>
-      <w:pPr>
-        <w:spacing w:before="0" w:after="40" w:line="259" w:lineRule="auto"/>
-      </w:pPr>
-      <w:r>
-        <w:rPr>
-          <w:rFonts w:ascii="Calibri" w:hAnsi="Calibri"/>
-          <w:b w:val="0"/>
-          <w:i w:val="0"/>
-          <w:color w:val="3D4A57"/>
-          <w:sz w:val="18"/>
-        </w:rPr>
-        <w:t>N.º de archivo / código HCU: _______________________________________________</w:t>
-      </w:r>
-    </w:p>
-    <w:p>
-      <w:pPr>
-        <w:spacing w:before="0" w:after="40" w:line="259" w:lineRule="auto"/>
-      </w:pPr>
-      <w:r>
-        <w:rPr>
-          <w:rFonts w:ascii="Calibri" w:hAnsi="Calibri"/>
-          <w:b w:val="0"/>
-          <w:i w:val="0"/>
-          <w:color w:val="3D4A57"/>
-          <w:sz w:val="18"/>
-        </w:rPr>
-        <w:t>Usuario (nombres o solo cédula/código*): _______________________________________________</w:t>
-      </w:r>
-    </w:p>
-    <w:p>
-      <w:pPr>
-        <w:spacing w:before="0" w:after="20" w:line="259" w:lineRule="auto"/>
-      </w:pPr>
-      <w:r>
-        <w:rPr>
-          <w:rFonts w:ascii="Calibri" w:hAnsi="Calibri"/>
-          <w:b w:val="0"/>
-          <w:i/>
-          <w:color w:val="3D4A57"/>
-          <w:sz w:val="14"/>
-        </w:rPr>
-        <w:t>*En enfermedades sensibles, usar cédula/código (Art. 13 Acdo. 5216-A).</w:t>
-      </w:r>
-    </w:p>
-    <w:p>
-      <w:pPr>
-        <w:spacing w:before="0" w:after="40" w:line="259" w:lineRule="auto"/>
-      </w:pPr>
-      <w:r>
-        <w:rPr>
-          <w:rFonts w:ascii="Calibri" w:hAnsi="Calibri"/>
-          <w:b w:val="0"/>
-          <w:i w:val="0"/>
-          <w:color w:val="3D4A57"/>
-          <w:sz w:val="18"/>
-        </w:rPr>
-        <w:t>Otros números: _______________________________________________</w:t>
-      </w:r>
-    </w:p>
-    <w:p>
-      <w:pPr>
-        <w:spacing w:before="120" w:after="40" w:line="259" w:lineRule="auto"/>
-      </w:pPr>
-      <w:r>
-        <w:rPr>
-          <w:rFonts w:ascii="Calibri" w:hAnsi="Calibri"/>
-          <w:b/>
-          <w:i w:val="0"/>
-          <w:color w:val="2A6F6F"/>
-          <w:sz w:val="20"/>
-        </w:rPr>
-        <w:t>4. ÚLTIMO MOVIMIENTO CONOCIDO</w:t>
-      </w:r>
-    </w:p>
-    <w:p>
-      <w:pPr>
-        <w:spacing w:before="0" w:after="40" w:line="259" w:lineRule="auto"/>
-      </w:pPr>
-      <w:r>
-        <w:rPr>
-          <w:rFonts w:ascii="Calibri" w:hAnsi="Calibri"/>
-          <w:b w:val="0"/>
-          <w:i w:val="0"/>
-          <w:color w:val="3D4A57"/>
-          <w:sz w:val="18"/>
-        </w:rPr>
-        <w:t>Fecha de salida del archivo: _______________________________________________</w:t>
-      </w:r>
-    </w:p>
-    <w:p>
-      <w:pPr>
-        <w:spacing w:before="0" w:after="40" w:line="259" w:lineRule="auto"/>
-      </w:pPr>
-      <w:r>
-        <w:rPr>
-          <w:rFonts w:ascii="Calibri" w:hAnsi="Calibri"/>
-          <w:b w:val="0"/>
-          <w:i w:val="0"/>
-          <w:color w:val="3D4A57"/>
-          <w:sz w:val="18"/>
-        </w:rPr>
-        <w:t>Servicio/área: _______________________________________________</w:t>
-      </w:r>
-    </w:p>
-    <w:p>
-      <w:pPr>
-        <w:spacing w:before="0" w:after="40" w:line="259" w:lineRule="auto"/>
-      </w:pPr>
-      <w:r>
-        <w:rPr>
-          <w:rFonts w:ascii="Calibri" w:hAnsi="Calibri"/>
-          <w:b w:val="0"/>
-          <w:i w:val="0"/>
-          <w:color w:val="3D4A57"/>
-          <w:sz w:val="18"/>
-        </w:rPr>
-        <w:t>Quién retiró: _______________________________________________</w:t>
-      </w:r>
-    </w:p>
-    <w:p>
-      <w:pPr>
-        <w:spacing w:before="0" w:after="40" w:line="259" w:lineRule="auto"/>
-      </w:pPr>
-      <w:r>
-        <w:rPr>
-          <w:rFonts w:ascii="Calibri" w:hAnsi="Calibri"/>
-          <w:b w:val="0"/>
-          <w:i w:val="0"/>
-          <w:color w:val="3D4A57"/>
-          <w:sz w:val="18"/>
-        </w:rPr>
-        <w:t>Motivo: _______________________________________________</w:t>
-      </w:r>
-    </w:p>
-    <w:p>
-      <w:pPr>
-        <w:spacing w:before="0" w:after="20"/>
-        <w:ind w:left="113"/>
-      </w:pPr>
-      <w:r>
-        <w:rPr>
-          <w:rFonts w:ascii="Calibri" w:hAnsi="Calibri"/>
-          <w:b w:val="0"/>
-          <w:i w:val="0"/>
-          <w:color w:val="3D4A57"/>
-          <w:sz w:val="18"/>
-        </w:rPr>
-        <w:t>☐  Había préstamo registrado: Sí</w:t>
-      </w:r>
-    </w:p>
-    <w:p>
-      <w:pPr>
-        <w:spacing w:before="0" w:after="20"/>
-        <w:ind w:left="113"/>
-      </w:pPr>
-      <w:r>
-        <w:rPr>
-          <w:rFonts w:ascii="Calibri" w:hAnsi="Calibri"/>
-          <w:b w:val="0"/>
-          <w:i w:val="0"/>
-          <w:color w:val="3D4A57"/>
-          <w:sz w:val="18"/>
-        </w:rPr>
-        <w:t>☐  Había préstamo registrado: No</w:t>
-      </w:r>
-    </w:p>
-    <w:p>
-      <w:pPr>
-        <w:spacing w:before="120" w:after="40" w:line="259" w:lineRule="auto"/>
-      </w:pPr>
-      <w:r>
-        <w:rPr>
-          <w:rFonts w:ascii="Calibri" w:hAnsi="Calibri"/>
-          <w:b/>
-          <w:i w:val="0"/>
-          <w:color w:val="2A6F6F"/>
-          <w:sz w:val="20"/>
-        </w:rPr>
-        <w:t>5. CONTENCIÓN INMEDIATA</w:t>
-      </w:r>
-    </w:p>
-    <w:p>
-      <w:pPr>
-        <w:spacing w:before="0" w:after="20"/>
-        <w:ind w:left="113"/>
-      </w:pPr>
-      <w:r>
-        <w:rPr>
-          <w:rFonts w:ascii="Calibri" w:hAnsi="Calibri"/>
-          <w:b w:val="0"/>
-          <w:i w:val="0"/>
-          <w:color w:val="3D4A57"/>
-          <w:sz w:val="18"/>
-        </w:rPr>
-        <w:t>☐  Área restringida</w:t>
-      </w:r>
-    </w:p>
-    <w:p>
-      <w:pPr>
-        <w:spacing w:before="0" w:after="20"/>
-        <w:ind w:left="113"/>
-      </w:pPr>
-      <w:r>
-        <w:rPr>
-          <w:rFonts w:ascii="Calibri" w:hAnsi="Calibri"/>
-          <w:b w:val="0"/>
-          <w:i w:val="0"/>
-          <w:color w:val="3D4A57"/>
-          <w:sz w:val="18"/>
-        </w:rPr>
-        <w:t>☐  Evidencia resguardada</w:t>
-      </w:r>
-    </w:p>
-    <w:p>
-      <w:pPr>
-        <w:spacing w:before="0" w:after="20"/>
-        <w:ind w:left="113"/>
-      </w:pPr>
-      <w:r>
-        <w:rPr>
-          <w:rFonts w:ascii="Calibri" w:hAnsi="Calibri"/>
-          <w:b w:val="0"/>
-          <w:i w:val="0"/>
-          <w:color w:val="3D4A57"/>
-          <w:sz w:val="18"/>
-        </w:rPr>
-        <w:t>☐  No se alteró ni descartó material</w:t>
-      </w:r>
-    </w:p>
-    <w:p>
-      <w:pPr>
-        <w:spacing w:before="0" w:after="20"/>
-        <w:ind w:left="113"/>
-      </w:pPr>
-      <w:r>
-        <w:rPr>
-          <w:rFonts w:ascii="Calibri" w:hAnsi="Calibri"/>
-          <w:b w:val="0"/>
-          <w:i w:val="0"/>
-          <w:color w:val="3D4A57"/>
-          <w:sz w:val="18"/>
-        </w:rPr>
-        <w:t>☐  Contingencia asistencial activada</w:t>
-      </w:r>
-    </w:p>
-    <w:p>
-      <w:pPr>
-        <w:spacing w:before="0" w:after="20"/>
-        <w:ind w:left="113"/>
-      </w:pPr>
-      <w:r>
-        <w:rPr>
-          <w:rFonts w:ascii="Calibri" w:hAnsi="Calibri"/>
-          <w:b w:val="0"/>
-          <w:i w:val="0"/>
-          <w:color w:val="3D4A57"/>
-          <w:sz w:val="18"/>
-        </w:rPr>
-        <w:t>☐  Otro</w:t>
-      </w:r>
-    </w:p>
-    <w:p>
-      <w:pPr>
-        <w:spacing w:before="120" w:after="40" w:line="259" w:lineRule="auto"/>
-      </w:pPr>
-      <w:r>
-        <w:rPr>
-          <w:rFonts w:ascii="Calibri" w:hAnsi="Calibri"/>
-          <w:b/>
-          <w:i w:val="0"/>
-          <w:color w:val="2A6F6F"/>
-          <w:sz w:val="20"/>
-        </w:rPr>
-        <w:t>6. NOTIFICACIONES</w:t>
-      </w:r>
-    </w:p>
-    <w:p>
-      <w:pPr>
-        <w:spacing w:before="0" w:after="40" w:line="259" w:lineRule="auto"/>
-      </w:pPr>
-      <w:r>
-        <w:rPr>
-          <w:rFonts w:ascii="Calibri" w:hAnsi="Calibri"/>
-          <w:b w:val="0"/>
-          <w:i w:val="0"/>
-          <w:color w:val="3D4A57"/>
-          <w:sz w:val="18"/>
-        </w:rPr>
-        <w:t>Archivo / Admisiones — hora __:__ — Nombre: _______________________________________________</w:t>
-      </w:r>
-    </w:p>
-    <w:p>
-      <w:pPr>
-        <w:spacing w:before="0" w:after="40" w:line="259" w:lineRule="auto"/>
-      </w:pPr>
-      <w:r>
-        <w:rPr>
-          <w:rFonts w:ascii="Calibri" w:hAnsi="Calibri"/>
-          <w:b w:val="0"/>
-          <w:i w:val="0"/>
-          <w:color w:val="3D4A57"/>
-          <w:sz w:val="18"/>
-        </w:rPr>
-        <w:t>Dirección / autoridad — hora __:__ — Nombre: _______________________________________________</w:t>
-      </w:r>
-    </w:p>
-    <w:p>
-      <w:pPr>
-        <w:spacing w:before="0" w:after="40" w:line="259" w:lineRule="auto"/>
-      </w:pPr>
-      <w:r>
-        <w:rPr>
-          <w:rFonts w:ascii="Calibri" w:hAnsi="Calibri"/>
-          <w:b w:val="0"/>
-          <w:i w:val="0"/>
-          <w:color w:val="3D4A57"/>
-          <w:sz w:val="18"/>
-        </w:rPr>
-        <w:t>Gestión de Calidad y Seguridad del Paciente — hora __:__ — Nombre: _______________________________________________</w:t>
-      </w:r>
-    </w:p>
-    <w:p>
-      <w:pPr>
-        <w:spacing w:before="0" w:after="40" w:line="259" w:lineRule="auto"/>
-      </w:pPr>
-      <w:r>
-        <w:rPr>
-          <w:rFonts w:ascii="Calibri" w:hAnsi="Calibri"/>
-          <w:b w:val="0"/>
-          <w:i w:val="0"/>
-          <w:color w:val="3D4A57"/>
-          <w:sz w:val="18"/>
-        </w:rPr>
-        <w:t>Tecnología (si aplica) — hora __:__ — Nombre: _______________________________________________</w:t>
-      </w:r>
-    </w:p>
-    <w:p>
-      <w:pPr>
-        <w:spacing w:before="120" w:after="40" w:line="259" w:lineRule="auto"/>
-      </w:pPr>
-      <w:r>
-        <w:rPr>
-          <w:rFonts w:ascii="Calibri" w:hAnsi="Calibri"/>
-          <w:b/>
-          <w:i w:val="0"/>
-          <w:color w:val="2A6F6F"/>
-          <w:sz w:val="20"/>
-        </w:rPr>
-        <w:t>7. OBSERVACIONES</w:t>
-      </w:r>
-    </w:p>
-    <w:p>
-      <w:pPr>
-        <w:spacing w:before="0" w:after="40" w:line="259" w:lineRule="auto"/>
-      </w:pPr>
-      <w:r>
-        <w:rPr>
-          <w:rFonts w:ascii="Calibri" w:hAnsi="Calibri"/>
-          <w:b w:val="0"/>
-          <w:i w:val="0"/>
-          <w:color w:val="3D4A57"/>
-          <w:sz w:val="18"/>
-        </w:rPr>
-        <w:t>: _______________________________________________</w:t>
-      </w:r>
-    </w:p>
-    <w:p>
-      <w:pPr>
-        <w:spacing w:before="0" w:after="40" w:line="259" w:lineRule="auto"/>
-      </w:pPr>
-      <w:r>
-        <w:rPr>
-          <w:rFonts w:ascii="Calibri" w:hAnsi="Calibri"/>
-          <w:b w:val="0"/>
-          <w:i w:val="0"/>
-          <w:color w:val="3D4A57"/>
-          <w:sz w:val="18"/>
-        </w:rPr>
-        <w:t>: _______________________________________________</w:t>
-      </w:r>
-    </w:p>
-    <w:p>
-      <w:pPr>
-        <w:spacing w:before="200" w:after="80" w:line="259" w:lineRule="auto"/>
-        <w:jc w:val="center"/>
-      </w:pPr>
-      <w:r>
-        <w:rPr>
-          <w:rFonts w:ascii="Calibri" w:hAnsi="Calibri"/>
-          <w:b/>
-          <w:i w:val="0"/>
-          <w:color w:val="1E3A5F"/>
-          <w:sz w:val="20"/>
-        </w:rPr>
-        <w:t>FIRMAS DE RESPONSABLES</w:t>
-      </w:r>
-    </w:p>
-    <w:tbl>
-      <w:tblPr>
-        <w:tblW w:type="auto" w:w="0"/>
-        <w:tblLook w:firstColumn="1" w:firstRow="1" w:lastColumn="0" w:lastRow="0" w:noHBand="0" w:noVBand="1" w:val="04A0"/>
-      </w:tblPr>
-      <w:tblGrid>
-        <w:gridCol w:w="3400"/>
-        <w:gridCol w:w="3400"/>
-        <w:gridCol w:w="3400"/>
-      </w:tblGrid>
-      <w:tr>
-        <w:tc>
-          <w:tcPr>
-            <w:tcW w:type="dxa" w:w="3400"/>
-            <w:shd w:fill="FFFFFF" w:val="clear"/>
-            <w:tcBorders>
-              <w:top w:val="single" w:sz="5" w:space="0" w:color="1E3A5F"/>
-              <w:left w:val="single" w:sz="5" w:space="0" w:color="1E3A5F"/>
-              <w:bottom w:val="single" w:sz="5" w:space="0" w:color="1E3A5F"/>
-              <w:right w:val="single" w:sz="5" w:space="0" w:color="1E3A5F"/>
-            </w:tcBorders>
-            <w:tcMar>
-              <w:top w:w="55" w:type="dxa"/>
-              <w:left w:w="35" w:type="dxa"/>
-              <w:bottom w:w="45" w:type="dxa"/>
-              <w:right w:w="35" w:type="dxa"/>
-            </w:tcMar>
-          </w:tcPr>
-          <w:p>
-            <w:pPr>
-              <w:jc w:val="center"/>
-            </w:pPr>
-            <w:r/>
-            <w:r>
-              <w:rPr>
-                <w:rFonts w:ascii="Calibri" w:hAnsi="Calibri"/>
-                <w:b/>
-                <w:i w:val="0"/>
-                <w:color w:val="2A6F6F"/>
-                <w:sz w:val="14"/>
-              </w:rPr>
-              <w:t>QUIEN DETECTA / REPORTA</w:t>
-              <w:br/>
-            </w:r>
-            <w:r>
-              <w:rPr>
-                <w:rFonts w:ascii="Calibri" w:hAnsi="Calibri"/>
-                <w:b w:val="0"/>
-                <w:i w:val="0"/>
-                <w:color w:val="3D4A57"/>
-                <w:sz w:val="16"/>
-              </w:rPr>
-              <w:t>Nombre: ____________________</w:t>
-              <w:br/>
-            </w:r>
-            <w:r>
-              <w:rPr>
-                <w:rFonts w:ascii="Calibri" w:hAnsi="Calibri"/>
-                <w:b w:val="0"/>
-                <w:i w:val="0"/>
-                <w:color w:val="3D4A57"/>
-                <w:sz w:val="16"/>
-              </w:rPr>
-              <w:br/>
-              <w:t>__________________</w:t>
-              <w:br/>
-              <w:t>Firma</w:t>
-              <w:br/>
-              <w:br/>
-              <w:t>___/___/______</w:t>
-              <w:br/>
-              <w:t>Fecha</w:t>
-            </w:r>
-          </w:p>
-        </w:tc>
-        <w:tc>
-          <w:tcPr>
-            <w:tcW w:type="dxa" w:w="3400"/>
-            <w:shd w:fill="FFFFFF" w:val="clear"/>
-            <w:tcBorders>
-              <w:top w:val="single" w:sz="5" w:space="0" w:color="1E3A5F"/>
-              <w:left w:val="single" w:sz="5" w:space="0" w:color="1E3A5F"/>
-              <w:bottom w:val="single" w:sz="5" w:space="0" w:color="1E3A5F"/>
-              <w:right w:val="single" w:sz="5" w:space="0" w:color="1E3A5F"/>
-            </w:tcBorders>
-            <w:tcMar>
-              <w:top w:w="55" w:type="dxa"/>
-              <w:left w:w="35" w:type="dxa"/>
-              <w:bottom w:w="45" w:type="dxa"/>
-              <w:right w:w="35" w:type="dxa"/>
-            </w:tcMar>
-          </w:tcPr>
-          <w:p>
-            <w:pPr>
-              <w:jc w:val="center"/>
-            </w:pPr>
-            <w:r/>
-            <w:r>
-              <w:rPr>
-                <w:rFonts w:ascii="Calibri" w:hAnsi="Calibri"/>
-                <w:b/>
-                <w:i w:val="0"/>
-                <w:color w:val="2A6F6F"/>
-                <w:sz w:val="14"/>
-              </w:rPr>
-              <w:t>JEFATURA DEL SERVICIO</w:t>
-              <w:br/>
-            </w:r>
-            <w:r>
-              <w:rPr>
-                <w:rFonts w:ascii="Calibri" w:hAnsi="Calibri"/>
-                <w:b w:val="0"/>
-                <w:i w:val="0"/>
-                <w:color w:val="3D4A57"/>
-                <w:sz w:val="16"/>
-              </w:rPr>
-              <w:t>Nombre: ____________________</w:t>
-              <w:br/>
-            </w:r>
-            <w:r>
-              <w:rPr>
-                <w:rFonts w:ascii="Calibri" w:hAnsi="Calibri"/>
-                <w:b w:val="0"/>
-                <w:i w:val="0"/>
-                <w:color w:val="3D4A57"/>
-                <w:sz w:val="16"/>
-              </w:rPr>
-              <w:br/>
-              <w:t>__________________</w:t>
-              <w:br/>
-              <w:t>Firma</w:t>
-              <w:br/>
-              <w:br/>
-              <w:t>___/___/______</w:t>
-              <w:br/>
-              <w:t>Fecha</w:t>
-            </w:r>
-          </w:p>
-        </w:tc>
-        <w:tc>
-          <w:tcPr>
-            <w:tcW w:type="dxa" w:w="3400"/>
-            <w:shd w:fill="FFFFFF" w:val="clear"/>
-            <w:tcBorders>
-              <w:top w:val="single" w:sz="5" w:space="0" w:color="1E3A5F"/>
-              <w:left w:val="single" w:sz="5" w:space="0" w:color="1E3A5F"/>
-              <w:bottom w:val="single" w:sz="5" w:space="0" w:color="1E3A5F"/>
-              <w:right w:val="single" w:sz="5" w:space="0" w:color="1E3A5F"/>
-            </w:tcBorders>
-            <w:tcMar>
-              <w:top w:w="55" w:type="dxa"/>
-              <w:left w:w="35" w:type="dxa"/>
-              <w:bottom w:w="45" w:type="dxa"/>
-              <w:right w:w="35" w:type="dxa"/>
-            </w:tcMar>
-          </w:tcPr>
-          <w:p>
-            <w:pPr>
-              <w:jc w:val="center"/>
-            </w:pPr>
-            <w:r/>
-            <w:r>
-              <w:rPr>
-                <w:rFonts w:ascii="Calibri" w:hAnsi="Calibri"/>
-                <w:b/>
-                <w:i w:val="0"/>
-                <w:color w:val="2A6F6F"/>
-                <w:sz w:val="14"/>
-              </w:rPr>
-              <w:t>RESPONSABLE DE ADMISIONES / ARCHIVO CLÍNICO</w:t>
-              <w:br/>
-            </w:r>
-            <w:r>
-              <w:rPr>
-                <w:rFonts w:ascii="Calibri" w:hAnsi="Calibri"/>
-                <w:b w:val="0"/>
-                <w:i w:val="0"/>
-                <w:color w:val="3D4A57"/>
-                <w:sz w:val="16"/>
-              </w:rPr>
-              <w:t>Nombre: ____________________</w:t>
-              <w:br/>
-            </w:r>
-            <w:r>
-              <w:rPr>
-                <w:rFonts w:ascii="Calibri" w:hAnsi="Calibri"/>
-                <w:b w:val="0"/>
-                <w:i w:val="0"/>
-                <w:color w:val="3D4A57"/>
-                <w:sz w:val="16"/>
-              </w:rPr>
-              <w:br/>
-              <w:t>__________________</w:t>
-              <w:br/>
-              <w:t>Firma</w:t>
-              <w:br/>
-              <w:br/>
-              <w:t>___/___/______</w:t>
-              <w:br/>
-              <w:t>Fecha</w:t>
-            </w:r>
-          </w:p>
-        </w:tc>
-      </w:tr>
-    </w:tbl>
-    <w:p>
-      <w:pPr>
-        <w:spacing w:before="0" w:after="80" w:line="259" w:lineRule="auto"/>
-      </w:pPr>
-    </w:p>
     <w:sectPr>
-      <w:headerReference w:type="default" r:id="rId9"/>
-      <w:footerReference w:type="default" r:id="rId10"/>
-      <w:pgSz w:w="12240" w:h="15840"/>
-      <w:pgMar w:top="794" w:right="1020" w:bottom="794" w:left="1020" w:header="720" w:footer="720" w:gutter="0"/>
+      <w:pgSz w:w="11906" w:h="16838"/>
+      <w:pgMar w:top="340" w:right="340" w:bottom="340" w:left="340" w:header="720" w:footer="720" w:gutter="0"/>
       <w:cols w:space="720"/>
       <w:docGrid w:linePitch="360"/>
     </w:sectPr>
   </w:body>
 </w:document>
-</file>
-
-<file path=word/footer1.xml><?xml version="1.0" encoding="utf-8"?>
-<w:ftr xmlns:m="http://schemas.openxmlformats.org/officeDocument/2006/math" xmlns:mc="http://schemas.openxmlformats.org/markup-compatibility/2006" xmlns:mo="http://schemas.microsoft.com/office/mac/office/2008/main" xmlns:mv="urn:schemas-microsoft-com:mac:vml" xmlns:o="urn:schemas-microsoft-com:office:office" xmlns:r="http://schemas.openxmlformats.org/officeDocument/2006/relationships" xmlns:v="urn:schemas-microsoft-com:vml" xmlns:w10="urn:schemas-microsoft-com:office:word" xmlns:w14="http://schemas.microsoft.com/office/word/2010/wordml" xmlns:w="http://schemas.openxmlformats.org/wordprocessingml/2006/main" xmlns:wne="http://schemas.microsoft.com/office/word/2006/wordml" xmlns:wp14="http://schemas.microsoft.com/office/word/2010/wordprocessingDrawing" xmlns:wp="http://schemas.openxmlformats.org/drawingml/2006/wordprocessingDrawing" xmlns:wpc="http://schemas.microsoft.com/office/word/2010/wordprocessingCanvas" xmlns:wpg="http://schemas.microsoft.com/office/word/2010/wordprocessingGroup" xmlns:wpi="http://schemas.microsoft.com/office/word/2010/wordprocessingInk" xmlns:wps="http://schemas.microsoft.com/office/word/2010/wordprocessingShape" mc:Ignorable="w14 wp14">
-  <w:p>
-    <w:pPr>
-      <w:pStyle w:val="Footer"/>
-      <w:jc w:val="center"/>
-    </w:pPr>
-    <w:r>
-      <w:rPr>
-        <w:rFonts w:ascii="Calibri" w:hAnsi="Calibri"/>
-        <w:b w:val="0"/>
-        <w:i w:val="0"/>
-        <w:color w:val="3D4A57"/>
-        <w:sz w:val="14"/>
-      </w:rPr>
-      <w:t>Ministerio de Salud Pública  ·  Contacto: 0991976454</w:t>
-    </w:r>
-  </w:p>
-</w:ftr>
-</file>
-
-<file path=word/header1.xml><?xml version="1.0" encoding="utf-8"?>
-<w:hdr xmlns:m="http://schemas.openxmlformats.org/officeDocument/2006/math" xmlns:mc="http://schemas.openxmlformats.org/markup-compatibility/2006" xmlns:mo="http://schemas.microsoft.com/office/mac/office/2008/main" xmlns:mv="urn:schemas-microsoft-com:mac:vml" xmlns:o="urn:schemas-microsoft-com:office:office" xmlns:r="http://schemas.openxmlformats.org/officeDocument/2006/relationships" xmlns:v="urn:schemas-microsoft-com:vml" xmlns:w10="urn:schemas-microsoft-com:office:word" xmlns:w14="http://schemas.microsoft.com/office/word/2010/wordml" xmlns:w="http://schemas.openxmlformats.org/wordprocessingml/2006/main" xmlns:wne="http://schemas.microsoft.com/office/word/2006/wordml" xmlns:wp14="http://schemas.microsoft.com/office/word/2010/wordprocessingDrawing" xmlns:wp="http://schemas.openxmlformats.org/drawingml/2006/wordprocessingDrawing" xmlns:wpc="http://schemas.microsoft.com/office/word/2010/wordprocessingCanvas" xmlns:wpg="http://schemas.microsoft.com/office/word/2010/wordprocessingGroup" xmlns:wpi="http://schemas.microsoft.com/office/word/2010/wordprocessingInk" xmlns:wps="http://schemas.microsoft.com/office/word/2010/wordprocessingShape" mc:Ignorable="w14 wp14">
-  <w:p>
-    <w:pPr>
-      <w:pStyle w:val="Header"/>
-      <w:jc w:val="right"/>
-    </w:pPr>
-    <w:r>
-      <w:rPr>
-        <w:rFonts w:ascii="Calibri" w:hAnsi="Calibri"/>
-        <w:b w:val="0"/>
-        <w:i w:val="0"/>
-        <w:color w:val="2A6F6F"/>
-        <w:sz w:val="14"/>
-      </w:rPr>
-      <w:t>PROT-HC-001  ·  Hospital General Puyo  ·  CONFIDENCIAL</w:t>
-    </w:r>
-  </w:p>
-</w:hdr>
 </file>
 
 <file path=word/numbering.xml><?xml version="1.0" encoding="utf-8"?>

</xml_diff>